<commit_message>
Add accuracy heatmap and precision/recall scatter visualizations
Adds the two final-report visualizations (accuracy heatmap, precision
vs. recall trade-off scatter) generated from results/full/summary.json,
plus the reproducible generation script. Embeds both into the findings
report (md + docx) as a new section 4.3.

Co-Authored-By: Claude Sonnet 5 <noreply@anthropic.com>
</commit_message>
<xml_diff>
--- a/HaluEval_Findings_and_Analysis.docx
+++ b/HaluEval_Findings_and_Analysis.docx
@@ -3032,6 +3032,126 @@
         <w:t>Note the extremes: Llama on summarization predicted "Yes" on all 1,000 instances (TN=FN=0) — a complete class collapse. Llama on QA is nearly as degenerate (only 6/1000 "No" predictions total). Gemma shows the opposite collapse pattern but less extreme (it does predict "No" the vast majority of the time across all three tasks).</w:t>
       </w:r>
     </w:p>
+    <w:p/>
+    <w:p>
+      <w:pPr>
+        <w:pStyle w:val="Heading2"/>
+      </w:pPr>
+      <w:r>
+        <w:t>4.3 Visualizations</w:t>
+      </w:r>
+    </w:p>
+    <w:p>
+      <w:r>
+        <w:rPr>
+          <w:b/>
+        </w:rPr>
+        <w:t xml:space="preserve">Figure 1 — Accuracy heatmap. </w:t>
+      </w:r>
+      <w:r>
+        <w:t>Color scale is fixed to 0.40-0.60 (rather than auto-scaled to this run's narrow spread) so shading reflects genuine distance from the 0.50 chance baseline, marked with a dashed line on the color bar.</w:t>
+      </w:r>
+    </w:p>
+    <w:p>
+      <w:pPr>
+        <w:jc w:val="center"/>
+      </w:pPr>
+      <w:r>
+        <w:drawing>
+          <wp:inline xmlns:a="http://schemas.openxmlformats.org/drawingml/2006/main" xmlns:pic="http://schemas.openxmlformats.org/drawingml/2006/picture">
+            <wp:extent cx="5760720" cy="3456432"/>
+            <wp:docPr id="1" name="Picture 1"/>
+            <wp:cNvGraphicFramePr>
+              <a:graphicFrameLocks noChangeAspect="1"/>
+            </wp:cNvGraphicFramePr>
+            <a:graphic>
+              <a:graphicData uri="http://schemas.openxmlformats.org/drawingml/2006/picture">
+                <pic:pic>
+                  <pic:nvPicPr>
+                    <pic:cNvPr id="0" name="accuracy_heatmap.png"/>
+                    <pic:cNvPicPr/>
+                  </pic:nvPicPr>
+                  <pic:blipFill>
+                    <a:blip r:embed="rId9"/>
+                    <a:stretch>
+                      <a:fillRect/>
+                    </a:stretch>
+                  </pic:blipFill>
+                  <pic:spPr>
+                    <a:xfrm>
+                      <a:off x="0" y="0"/>
+                      <a:ext cx="5760720" cy="3456432"/>
+                    </a:xfrm>
+                    <a:prstGeom prst="rect"/>
+                  </pic:spPr>
+                </pic:pic>
+              </a:graphicData>
+            </a:graphic>
+          </wp:inline>
+        </w:drawing>
+      </w:r>
+    </w:p>
+    <w:p/>
+    <w:p>
+      <w:r>
+        <w:rPr>
+          <w:b/>
+        </w:rPr>
+        <w:t xml:space="preserve">Figure 2 — Precision vs. recall trade-off. </w:t>
+      </w:r>
+      <w:r>
+        <w:t>One point per model-task pair (9 total), color = model, shape = task. Dashed reference lines mark chance (0.50) on both axes. Point identity is carried by the legend (color x shape); exact values are in the 4.1 table.</w:t>
+      </w:r>
+    </w:p>
+    <w:p>
+      <w:pPr>
+        <w:jc w:val="center"/>
+      </w:pPr>
+      <w:r>
+        <w:drawing>
+          <wp:inline xmlns:a="http://schemas.openxmlformats.org/drawingml/2006/main" xmlns:pic="http://schemas.openxmlformats.org/drawingml/2006/picture">
+            <wp:extent cx="5760720" cy="3960495"/>
+            <wp:docPr id="2" name="Picture 2"/>
+            <wp:cNvGraphicFramePr>
+              <a:graphicFrameLocks noChangeAspect="1"/>
+            </wp:cNvGraphicFramePr>
+            <a:graphic>
+              <a:graphicData uri="http://schemas.openxmlformats.org/drawingml/2006/picture">
+                <pic:pic>
+                  <pic:nvPicPr>
+                    <pic:cNvPr id="0" name="precision_recall_scatter.png"/>
+                    <pic:cNvPicPr/>
+                  </pic:nvPicPr>
+                  <pic:blipFill>
+                    <a:blip r:embed="rId10"/>
+                    <a:stretch>
+                      <a:fillRect/>
+                    </a:stretch>
+                  </pic:blipFill>
+                  <pic:spPr>
+                    <a:xfrm>
+                      <a:off x="0" y="0"/>
+                      <a:ext cx="5760720" cy="3960495"/>
+                    </a:xfrm>
+                    <a:prstGeom prst="rect"/>
+                  </pic:spPr>
+                </pic:pic>
+              </a:graphicData>
+            </a:graphic>
+          </wp:inline>
+        </w:drawing>
+      </w:r>
+    </w:p>
+    <w:p/>
+    <w:p>
+      <w:r>
+        <w:rPr>
+          <w:b w:val="0"/>
+          <w:i w:val="0"/>
+        </w:rPr>
+        <w:t>The scatter makes the degenerate-strategy finding visually immediate: Llama's three points cluster tightly on the right edge (recall 0.84-1.00) hugging the precision=chance line, Gemma's three points cluster on the left edge (recall 0.05-0.10), and Qwen is the only model with points clearly off both edges.</w:t>
+      </w:r>
+    </w:p>
     <w:p>
       <w:r>
         <w:br w:type="page"/>

</xml_diff>